<commit_message>
docs: update project synopsis, SRS, and design documentation
</commit_message>
<xml_diff>
--- a/DineSync_Project_Synopsis_1.docx
+++ b/DineSync_Project_Synopsis_1.docx
@@ -12,7 +12,6 @@
         <w:spacing w:after="200"/>
         <w:jc w:val="center"/>
       </w:pPr>
-      <w:proofErr w:type="spellStart"/>
       <w:r>
         <w:rPr>
           <w:b/>
@@ -21,18 +20,7 @@
           <w:sz w:val="64"/>
           <w:szCs w:val="64"/>
         </w:rPr>
-        <w:t>DineSync</w:t>
-      </w:r>
-      <w:proofErr w:type="spellEnd"/>
-      <w:r>
-        <w:rPr>
-          <w:b/>
-          <w:bCs/>
-          <w:color w:val="1F3B57"/>
-          <w:sz w:val="64"/>
-          <w:szCs w:val="64"/>
-        </w:rPr>
-        <w:t xml:space="preserve"> AI</w:t>
+        <w:t>DineSync AI</w:t>
       </w:r>
     </w:p>
     <w:p>
@@ -99,22 +87,35 @@
           <w:b/>
           <w:bCs/>
         </w:rPr>
-        <w:t>Submitted by</w:t>
-      </w:r>
-      <w:proofErr w:type="gramStart"/>
+        <w:t>Submitted by:</w:t>
+      </w:r>
+      <w:r>
+        <w:t xml:space="preserve">  </w:t>
+      </w:r>
+      <w:r>
+        <w:t>Krithish Ravindra Suvarna (25225013)</w:t>
+      </w:r>
+    </w:p>
+    <w:p>
+      <w:pPr>
+        <w:spacing w:after="100"/>
+        <w:jc w:val="center"/>
+      </w:pPr>
       <w:r>
         <w:rPr>
           <w:b/>
           <w:bCs/>
         </w:rPr>
-        <w:t>:</w:t>
-      </w:r>
-      <w:r>
-        <w:t xml:space="preserve">  [</w:t>
-      </w:r>
-      <w:proofErr w:type="gramEnd"/>
-      <w:r>
-        <w:t>Student Name(s) / Roll Number]</w:t>
+        <w:t>Under the guidance of:</w:t>
+      </w:r>
+      <w:r>
+        <w:t xml:space="preserve">  </w:t>
+      </w:r>
+      <w:r>
+        <w:t>Dr. Ramesh Chandra Poonia</w:t>
+      </w:r>
+      <w:r>
+        <w:t xml:space="preserve"> </w:t>
       </w:r>
     </w:p>
     <w:p>
@@ -127,106 +128,29 @@
           <w:b/>
           <w:bCs/>
         </w:rPr>
-        <w:t>Under the guidance of</w:t>
-      </w:r>
-      <w:proofErr w:type="gramStart"/>
+        <w:t>Department:</w:t>
+      </w:r>
+      <w:r>
+        <w:t xml:space="preserve">  </w:t>
+      </w:r>
+      <w:r>
+        <w:t xml:space="preserve">4 MCA </w:t>
+      </w:r>
+    </w:p>
+    <w:p>
+      <w:pPr>
+        <w:spacing w:after="100"/>
+        <w:jc w:val="center"/>
+      </w:pPr>
       <w:r>
         <w:rPr>
           <w:b/>
           <w:bCs/>
         </w:rPr>
-        <w:t>:</w:t>
-      </w:r>
-      <w:r>
-        <w:t xml:space="preserve">  [</w:t>
-      </w:r>
-      <w:proofErr w:type="gramEnd"/>
-      <w:r>
-        <w:t>Guide / Supervisor Name]</w:t>
-      </w:r>
-    </w:p>
-    <w:p>
-      <w:pPr>
-        <w:spacing w:after="100"/>
-        <w:jc w:val="center"/>
-      </w:pPr>
-      <w:r>
-        <w:rPr>
-          <w:b/>
-          <w:bCs/>
-        </w:rPr>
-        <w:t>Department</w:t>
-      </w:r>
-      <w:proofErr w:type="gramStart"/>
-      <w:r>
-        <w:rPr>
-          <w:b/>
-          <w:bCs/>
-        </w:rPr>
-        <w:t>:</w:t>
-      </w:r>
-      <w:r>
-        <w:t xml:space="preserve">  [</w:t>
-      </w:r>
-      <w:proofErr w:type="gramEnd"/>
-      <w:r>
-        <w:t>Department Name]</w:t>
-      </w:r>
-    </w:p>
-    <w:p>
-      <w:pPr>
-        <w:spacing w:after="100"/>
-        <w:jc w:val="center"/>
-      </w:pPr>
-      <w:r>
-        <w:rPr>
-          <w:b/>
-          <w:bCs/>
-        </w:rPr>
-        <w:t>Institution</w:t>
-      </w:r>
-      <w:proofErr w:type="gramStart"/>
-      <w:r>
-        <w:rPr>
-          <w:b/>
-          <w:bCs/>
-        </w:rPr>
-        <w:t>:</w:t>
-      </w:r>
-      <w:r>
-        <w:t xml:space="preserve">  [</w:t>
-      </w:r>
-      <w:proofErr w:type="gramEnd"/>
-      <w:r>
-        <w:t>College / University Name]</w:t>
-      </w:r>
-    </w:p>
-    <w:p>
-      <w:pPr>
-        <w:spacing w:after="100"/>
-        <w:jc w:val="center"/>
-      </w:pPr>
-      <w:r>
-        <w:rPr>
-          <w:b/>
-          <w:bCs/>
-        </w:rPr>
-        <w:t>Academic Year</w:t>
-      </w:r>
-      <w:proofErr w:type="gramStart"/>
-      <w:r>
-        <w:rPr>
-          <w:b/>
-          <w:bCs/>
-        </w:rPr>
-        <w:t>:</w:t>
-      </w:r>
-      <w:r>
-        <w:t xml:space="preserve">  [</w:t>
-      </w:r>
-      <w:proofErr w:type="gramEnd"/>
-      <w:r>
-        <w:t>20XX – 20XX]</w:t>
+        <w:t xml:space="preserve">Date: </w:t>
+      </w:r>
+      <w:r>
+        <w:t>01-08-2026</w:t>
       </w:r>
     </w:p>
     <w:p>
@@ -473,13 +397,8 @@
         <w:spacing w:after="160" w:line="300" w:lineRule="auto"/>
         <w:jc w:val="both"/>
       </w:pPr>
-      <w:proofErr w:type="spellStart"/>
-      <w:r>
-        <w:t>DineSync</w:t>
-      </w:r>
-      <w:proofErr w:type="spellEnd"/>
-      <w:r>
-        <w:t xml:space="preserve"> AI is proposed as a single, cloud-native, multi-tenant Software-as-a-Service (SaaS) platform that unifies Point-of-Sale (POS) billing, a real-time Kitchen Display System (KDS), QR-code based guest self-ordering, Customer Relationship Management (CRM) and loyalty, inventory and vendor management, staff attendance and payroll, business analytics, and a dedicated Artificial Intelligence microservice that turns historical operating data into forward-looking forecasts and recommendations.</w:t>
+      <w:r>
+        <w:t>DineSync AI is proposed as a single, cloud-native, multi-tenant Software-as-a-Service (SaaS) platform that unifies Point-of-Sale (POS) billing, a real-time Kitchen Display System (KDS), QR-code based guest self-ordering, Customer Relationship Management (CRM) and loyalty, inventory and vendor management, staff attendance and payroll, business analytics, and a dedicated Artificial Intelligence microservice that turns historical operating data into forward-looking forecasts and recommendations.</w:t>
       </w:r>
     </w:p>
     <w:p>
@@ -673,14 +592,9 @@
         <w:spacing w:after="160" w:line="300" w:lineRule="auto"/>
         <w:jc w:val="both"/>
       </w:pPr>
-      <w:proofErr w:type="spellStart"/>
       <w:r>
         <w:lastRenderedPageBreak/>
-        <w:t>DineSync</w:t>
-      </w:r>
-      <w:proofErr w:type="spellEnd"/>
-      <w:r>
-        <w:t xml:space="preserve"> AI proposes a three-pillar architecture that keeps each concern cleanly separated while unifying them through a shared data layer and real-time event bus:</w:t>
+        <w:t>DineSync AI proposes a three-pillar architecture that keeps each concern cleanly separated while unifying them through a shared data layer and real-time event bus:</w:t>
       </w:r>
     </w:p>
     <w:p>
@@ -719,15 +633,7 @@
         <w:spacing w:after="80" w:line="280" w:lineRule="auto"/>
       </w:pPr>
       <w:r>
-        <w:t>Predictive Engine (AI Microservice) — a Python/</w:t>
-      </w:r>
-      <w:proofErr w:type="spellStart"/>
-      <w:r>
-        <w:t>FastAPI</w:t>
-      </w:r>
-      <w:proofErr w:type="spellEnd"/>
-      <w:r>
-        <w:t xml:space="preserve"> service that hosts eight purpose-built predictive and NLP models covering sales, demand, inventory, wait-time, recommendations, and sentiment.</w:t>
+        <w:t>Predictive Engine (AI Microservice) — a Python/FastAPI service that hosts eight purpose-built predictive and NLP models covering sales, demand, inventory, wait-time, recommendations, and sentiment.</w:t>
       </w:r>
     </w:p>
     <w:p>
@@ -792,29 +698,7 @@
           <w:sz w:val="18"/>
           <w:szCs w:val="18"/>
         </w:rPr>
-        <w:t xml:space="preserve">Figure 1: High-level three-tier system architecture of </w:t>
-      </w:r>
-      <w:proofErr w:type="spellStart"/>
-      <w:r>
-        <w:rPr>
-          <w:i/>
-          <w:iCs/>
-          <w:color w:val="5A6B7A"/>
-          <w:sz w:val="18"/>
-          <w:szCs w:val="18"/>
-        </w:rPr>
-        <w:t>DineSync</w:t>
-      </w:r>
-      <w:proofErr w:type="spellEnd"/>
-      <w:r>
-        <w:rPr>
-          <w:i/>
-          <w:iCs/>
-          <w:color w:val="5A6B7A"/>
-          <w:sz w:val="18"/>
-          <w:szCs w:val="18"/>
-        </w:rPr>
-        <w:t xml:space="preserve"> AI.</w:t>
+        <w:t>Figure 1: High-level three-tier system architecture of DineSync AI.</w:t>
       </w:r>
     </w:p>
     <w:p>
@@ -949,15 +833,7 @@
         <w:jc w:val="both"/>
       </w:pPr>
       <w:r>
-        <w:t xml:space="preserve">The scope of </w:t>
-      </w:r>
-      <w:proofErr w:type="spellStart"/>
-      <w:r>
-        <w:t>DineSync</w:t>
-      </w:r>
-      <w:proofErr w:type="spellEnd"/>
-      <w:r>
-        <w:t xml:space="preserve"> AI covers the complete restaurant operations lifecycle for dine-in, takeaway, and QR-ordered service across one or more branches of a tenant restaurant:</w:t>
+        <w:t>The scope of DineSync AI covers the complete restaurant operations lifecycle for dine-in, takeaway, and QR-ordered service across one or more branches of a tenant restaurant:</w:t>
       </w:r>
     </w:p>
     <w:p>
@@ -1083,15 +959,7 @@
         <w:jc w:val="both"/>
       </w:pPr>
       <w:r>
-        <w:t>Out of scope for the current version: native mobile applications, direct integration with third-party delivery aggregators (</w:t>
-      </w:r>
-      <w:proofErr w:type="spellStart"/>
-      <w:r>
-        <w:t>UberEats</w:t>
-      </w:r>
-      <w:proofErr w:type="spellEnd"/>
-      <w:r>
-        <w:t>, DoorDash), and payment gateway certification for production card processing — these are identified as future roadmap items (Section 11).</w:t>
+        <w:t>Out of scope for the current version: native mobile applications, direct integration with third-party delivery aggregators (UberEats, DoorDash), and payment gateway certification for production card processing — these are identified as future roadmap items (Section 11).</w:t>
       </w:r>
     </w:p>
     <w:p>
@@ -1134,12 +1002,6 @@
         <w:gridCol w:w="5660"/>
       </w:tblGrid>
       <w:tr>
-        <w:tblPrEx>
-          <w:tblCellMar>
-            <w:top w:w="0" w:type="dxa"/>
-            <w:bottom w:w="0" w:type="dxa"/>
-          </w:tblCellMar>
-        </w:tblPrEx>
         <w:trPr>
           <w:tblHeader/>
         </w:trPr>
@@ -1220,12 +1082,6 @@
         </w:tc>
       </w:tr>
       <w:tr>
-        <w:tblPrEx>
-          <w:tblCellMar>
-            <w:top w:w="0" w:type="dxa"/>
-            <w:bottom w:w="0" w:type="dxa"/>
-          </w:tblCellMar>
-        </w:tblPrEx>
         <w:tc>
           <w:tcPr>
             <w:tcW w:w="700" w:type="dxa"/>
@@ -1291,12 +1147,6 @@
         </w:tc>
       </w:tr>
       <w:tr>
-        <w:tblPrEx>
-          <w:tblCellMar>
-            <w:top w:w="0" w:type="dxa"/>
-            <w:bottom w:w="0" w:type="dxa"/>
-          </w:tblCellMar>
-        </w:tblPrEx>
         <w:tc>
           <w:tcPr>
             <w:tcW w:w="700" w:type="dxa"/>
@@ -1365,12 +1215,6 @@
         </w:tc>
       </w:tr>
       <w:tr>
-        <w:tblPrEx>
-          <w:tblCellMar>
-            <w:top w:w="0" w:type="dxa"/>
-            <w:bottom w:w="0" w:type="dxa"/>
-          </w:tblCellMar>
-        </w:tblPrEx>
         <w:tc>
           <w:tcPr>
             <w:tcW w:w="700" w:type="dxa"/>
@@ -1436,12 +1280,6 @@
         </w:tc>
       </w:tr>
       <w:tr>
-        <w:tblPrEx>
-          <w:tblCellMar>
-            <w:top w:w="0" w:type="dxa"/>
-            <w:bottom w:w="0" w:type="dxa"/>
-          </w:tblCellMar>
-        </w:tblPrEx>
         <w:tc>
           <w:tcPr>
             <w:tcW w:w="700" w:type="dxa"/>
@@ -1510,12 +1348,6 @@
         </w:tc>
       </w:tr>
       <w:tr>
-        <w:tblPrEx>
-          <w:tblCellMar>
-            <w:top w:w="0" w:type="dxa"/>
-            <w:bottom w:w="0" w:type="dxa"/>
-          </w:tblCellMar>
-        </w:tblPrEx>
         <w:tc>
           <w:tcPr>
             <w:tcW w:w="700" w:type="dxa"/>
@@ -1581,12 +1413,6 @@
         </w:tc>
       </w:tr>
       <w:tr>
-        <w:tblPrEx>
-          <w:tblCellMar>
-            <w:top w:w="0" w:type="dxa"/>
-            <w:bottom w:w="0" w:type="dxa"/>
-          </w:tblCellMar>
-        </w:tblPrEx>
         <w:tc>
           <w:tcPr>
             <w:tcW w:w="700" w:type="dxa"/>
@@ -1655,12 +1481,6 @@
         </w:tc>
       </w:tr>
       <w:tr>
-        <w:tblPrEx>
-          <w:tblCellMar>
-            <w:top w:w="0" w:type="dxa"/>
-            <w:bottom w:w="0" w:type="dxa"/>
-          </w:tblCellMar>
-        </w:tblPrEx>
         <w:tc>
           <w:tcPr>
             <w:tcW w:w="700" w:type="dxa"/>
@@ -1726,12 +1546,6 @@
         </w:tc>
       </w:tr>
       <w:tr>
-        <w:tblPrEx>
-          <w:tblCellMar>
-            <w:top w:w="0" w:type="dxa"/>
-            <w:bottom w:w="0" w:type="dxa"/>
-          </w:tblCellMar>
-        </w:tblPrEx>
         <w:tc>
           <w:tcPr>
             <w:tcW w:w="700" w:type="dxa"/>
@@ -1800,12 +1614,6 @@
         </w:tc>
       </w:tr>
       <w:tr>
-        <w:tblPrEx>
-          <w:tblCellMar>
-            <w:top w:w="0" w:type="dxa"/>
-            <w:bottom w:w="0" w:type="dxa"/>
-          </w:tblCellMar>
-        </w:tblPrEx>
         <w:tc>
           <w:tcPr>
             <w:tcW w:w="700" w:type="dxa"/>
@@ -1871,12 +1679,6 @@
         </w:tc>
       </w:tr>
       <w:tr>
-        <w:tblPrEx>
-          <w:tblCellMar>
-            <w:top w:w="0" w:type="dxa"/>
-            <w:bottom w:w="0" w:type="dxa"/>
-          </w:tblCellMar>
-        </w:tblPrEx>
         <w:tc>
           <w:tcPr>
             <w:tcW w:w="700" w:type="dxa"/>
@@ -1946,12 +1748,6 @@
         </w:tc>
       </w:tr>
       <w:tr>
-        <w:tblPrEx>
-          <w:tblCellMar>
-            <w:top w:w="0" w:type="dxa"/>
-            <w:bottom w:w="0" w:type="dxa"/>
-          </w:tblCellMar>
-        </w:tblPrEx>
         <w:tc>
           <w:tcPr>
             <w:tcW w:w="700" w:type="dxa"/>
@@ -2017,12 +1813,6 @@
         </w:tc>
       </w:tr>
       <w:tr>
-        <w:tblPrEx>
-          <w:tblCellMar>
-            <w:top w:w="0" w:type="dxa"/>
-            <w:bottom w:w="0" w:type="dxa"/>
-          </w:tblCellMar>
-        </w:tblPrEx>
         <w:tc>
           <w:tcPr>
             <w:tcW w:w="700" w:type="dxa"/>
@@ -2091,12 +1881,6 @@
         </w:tc>
       </w:tr>
       <w:tr>
-        <w:tblPrEx>
-          <w:tblCellMar>
-            <w:top w:w="0" w:type="dxa"/>
-            <w:bottom w:w="0" w:type="dxa"/>
-          </w:tblCellMar>
-        </w:tblPrEx>
         <w:tc>
           <w:tcPr>
             <w:tcW w:w="700" w:type="dxa"/>
@@ -2156,34 +1940,12 @@
                 <w:sz w:val="20"/>
                 <w:szCs w:val="20"/>
               </w:rPr>
-              <w:t xml:space="preserve">Eight predictive/NLP models via </w:t>
-            </w:r>
-            <w:proofErr w:type="spellStart"/>
-            <w:r>
-              <w:rPr>
-                <w:sz w:val="20"/>
-                <w:szCs w:val="20"/>
-              </w:rPr>
-              <w:t>FastAPI</w:t>
-            </w:r>
-            <w:proofErr w:type="spellEnd"/>
-            <w:r>
-              <w:rPr>
-                <w:sz w:val="20"/>
-                <w:szCs w:val="20"/>
-              </w:rPr>
-              <w:t xml:space="preserve"> microservice</w:t>
+              <w:t>Eight predictive/NLP models via FastAPI microservice</w:t>
             </w:r>
           </w:p>
         </w:tc>
       </w:tr>
       <w:tr>
-        <w:tblPrEx>
-          <w:tblCellMar>
-            <w:top w:w="0" w:type="dxa"/>
-            <w:bottom w:w="0" w:type="dxa"/>
-          </w:tblCellMar>
-        </w:tblPrEx>
         <w:tc>
           <w:tcPr>
             <w:tcW w:w="700" w:type="dxa"/>
@@ -2252,12 +2014,6 @@
         </w:tc>
       </w:tr>
       <w:tr>
-        <w:tblPrEx>
-          <w:tblCellMar>
-            <w:top w:w="0" w:type="dxa"/>
-            <w:bottom w:w="0" w:type="dxa"/>
-          </w:tblCellMar>
-        </w:tblPrEx>
         <w:tc>
           <w:tcPr>
             <w:tcW w:w="700" w:type="dxa"/>
@@ -2317,27 +2073,12 @@
                 <w:sz w:val="20"/>
                 <w:szCs w:val="20"/>
               </w:rPr>
-              <w:t xml:space="preserve">Multi-channel alerts, scheduled jobs, alert </w:t>
-            </w:r>
-            <w:proofErr w:type="spellStart"/>
-            <w:r>
-              <w:rPr>
-                <w:sz w:val="20"/>
-                <w:szCs w:val="20"/>
-              </w:rPr>
-              <w:t>center</w:t>
-            </w:r>
-            <w:proofErr w:type="spellEnd"/>
+              <w:t>Multi-channel alerts, scheduled jobs, alert center</w:t>
+            </w:r>
           </w:p>
         </w:tc>
       </w:tr>
       <w:tr>
-        <w:tblPrEx>
-          <w:tblCellMar>
-            <w:top w:w="0" w:type="dxa"/>
-            <w:bottom w:w="0" w:type="dxa"/>
-          </w:tblCellMar>
-        </w:tblPrEx>
         <w:tc>
           <w:tcPr>
             <w:tcW w:w="700" w:type="dxa"/>
@@ -2445,12 +2186,6 @@
         <w:gridCol w:w="6760"/>
       </w:tblGrid>
       <w:tr>
-        <w:tblPrEx>
-          <w:tblCellMar>
-            <w:top w:w="0" w:type="dxa"/>
-            <w:bottom w:w="0" w:type="dxa"/>
-          </w:tblCellMar>
-        </w:tblPrEx>
         <w:trPr>
           <w:tblHeader/>
         </w:trPr>
@@ -2506,12 +2241,6 @@
         </w:tc>
       </w:tr>
       <w:tr>
-        <w:tblPrEx>
-          <w:tblCellMar>
-            <w:top w:w="0" w:type="dxa"/>
-            <w:bottom w:w="0" w:type="dxa"/>
-          </w:tblCellMar>
-        </w:tblPrEx>
         <w:tc>
           <w:tcPr>
             <w:tcW w:w="2600" w:type="dxa"/>
@@ -2550,66 +2279,12 @@
                 <w:sz w:val="20"/>
                 <w:szCs w:val="20"/>
               </w:rPr>
-              <w:t xml:space="preserve">React 18, Vite, Tailwind CSS, </w:t>
-            </w:r>
-            <w:proofErr w:type="spellStart"/>
-            <w:r>
-              <w:rPr>
-                <w:sz w:val="20"/>
-                <w:szCs w:val="20"/>
-              </w:rPr>
-              <w:t>shadcn</w:t>
-            </w:r>
-            <w:proofErr w:type="spellEnd"/>
-            <w:r>
-              <w:rPr>
-                <w:sz w:val="20"/>
-                <w:szCs w:val="20"/>
-              </w:rPr>
-              <w:t>/</w:t>
-            </w:r>
-            <w:proofErr w:type="spellStart"/>
-            <w:r>
-              <w:rPr>
-                <w:sz w:val="20"/>
-                <w:szCs w:val="20"/>
-              </w:rPr>
-              <w:t>ui</w:t>
-            </w:r>
-            <w:proofErr w:type="spellEnd"/>
-            <w:r>
-              <w:rPr>
-                <w:sz w:val="20"/>
-                <w:szCs w:val="20"/>
-              </w:rPr>
-              <w:t xml:space="preserve">, </w:t>
-            </w:r>
-            <w:proofErr w:type="spellStart"/>
-            <w:r>
-              <w:rPr>
-                <w:sz w:val="20"/>
-                <w:szCs w:val="20"/>
-              </w:rPr>
-              <w:t>Zustand</w:t>
-            </w:r>
-            <w:proofErr w:type="spellEnd"/>
-            <w:r>
-              <w:rPr>
-                <w:sz w:val="20"/>
-                <w:szCs w:val="20"/>
-              </w:rPr>
-              <w:t xml:space="preserve"> (state), Recharts, Socket.IO Client, Axios</w:t>
+              <w:t>React 18, Vite, Tailwind CSS, shadcn/ui, Zustand (state), Recharts, Socket.IO Client, Axios</w:t>
             </w:r>
           </w:p>
         </w:tc>
       </w:tr>
       <w:tr>
-        <w:tblPrEx>
-          <w:tblCellMar>
-            <w:top w:w="0" w:type="dxa"/>
-            <w:bottom w:w="0" w:type="dxa"/>
-          </w:tblCellMar>
-        </w:tblPrEx>
         <w:tc>
           <w:tcPr>
             <w:tcW w:w="2600" w:type="dxa"/>
@@ -2650,43 +2325,12 @@
                 <w:sz w:val="20"/>
                 <w:szCs w:val="20"/>
               </w:rPr>
-              <w:t>Node.js, Express.js, MongoDB with Mongoose ODM, Socket.IO, Node-</w:t>
-            </w:r>
-            <w:proofErr w:type="spellStart"/>
-            <w:r>
-              <w:rPr>
-                <w:sz w:val="20"/>
-                <w:szCs w:val="20"/>
-              </w:rPr>
-              <w:t>cron</w:t>
-            </w:r>
-            <w:proofErr w:type="spellEnd"/>
-            <w:r>
-              <w:rPr>
-                <w:sz w:val="20"/>
-                <w:szCs w:val="20"/>
-              </w:rPr>
-              <w:t xml:space="preserve">, </w:t>
-            </w:r>
-            <w:proofErr w:type="spellStart"/>
-            <w:r>
-              <w:rPr>
-                <w:sz w:val="20"/>
-                <w:szCs w:val="20"/>
-              </w:rPr>
-              <w:t>Nodemailer</w:t>
-            </w:r>
-            <w:proofErr w:type="spellEnd"/>
+              <w:t>Node.js, Express.js, MongoDB with Mongoose ODM, Socket.IO, Node-cron, Nodemailer</w:t>
+            </w:r>
           </w:p>
         </w:tc>
       </w:tr>
       <w:tr>
-        <w:tblPrEx>
-          <w:tblCellMar>
-            <w:top w:w="0" w:type="dxa"/>
-            <w:bottom w:w="0" w:type="dxa"/>
-          </w:tblCellMar>
-        </w:tblPrEx>
         <w:tc>
           <w:tcPr>
             <w:tcW w:w="2600" w:type="dxa"/>
@@ -2725,66 +2369,12 @@
                 <w:sz w:val="20"/>
                 <w:szCs w:val="20"/>
               </w:rPr>
-              <w:t xml:space="preserve">Python 3.10+, </w:t>
-            </w:r>
-            <w:proofErr w:type="spellStart"/>
-            <w:r>
-              <w:rPr>
-                <w:sz w:val="20"/>
-                <w:szCs w:val="20"/>
-              </w:rPr>
-              <w:t>FastAPI</w:t>
-            </w:r>
-            <w:proofErr w:type="spellEnd"/>
-            <w:r>
-              <w:rPr>
-                <w:sz w:val="20"/>
-                <w:szCs w:val="20"/>
-              </w:rPr>
-              <w:t xml:space="preserve">, </w:t>
-            </w:r>
-            <w:proofErr w:type="spellStart"/>
-            <w:r>
-              <w:rPr>
-                <w:sz w:val="20"/>
-                <w:szCs w:val="20"/>
-              </w:rPr>
-              <w:t>Uvicorn</w:t>
-            </w:r>
-            <w:proofErr w:type="spellEnd"/>
-            <w:r>
-              <w:rPr>
-                <w:sz w:val="20"/>
-                <w:szCs w:val="20"/>
-              </w:rPr>
-              <w:t xml:space="preserve">, </w:t>
-            </w:r>
-            <w:proofErr w:type="spellStart"/>
-            <w:r>
-              <w:rPr>
-                <w:sz w:val="20"/>
-                <w:szCs w:val="20"/>
-              </w:rPr>
-              <w:t>PyData</w:t>
-            </w:r>
-            <w:proofErr w:type="spellEnd"/>
-            <w:r>
-              <w:rPr>
-                <w:sz w:val="20"/>
-                <w:szCs w:val="20"/>
-              </w:rPr>
-              <w:t xml:space="preserve"> stack (predictive models &amp; NLP)</w:t>
+              <w:t>Python 3.10+, FastAPI, Uvicorn, PyData stack (predictive models &amp; NLP)</w:t>
             </w:r>
           </w:p>
         </w:tc>
       </w:tr>
       <w:tr>
-        <w:tblPrEx>
-          <w:tblCellMar>
-            <w:top w:w="0" w:type="dxa"/>
-            <w:bottom w:w="0" w:type="dxa"/>
-          </w:tblCellMar>
-        </w:tblPrEx>
         <w:tc>
           <w:tcPr>
             <w:tcW w:w="2600" w:type="dxa"/>
@@ -2831,12 +2421,6 @@
         </w:tc>
       </w:tr>
       <w:tr>
-        <w:tblPrEx>
-          <w:tblCellMar>
-            <w:top w:w="0" w:type="dxa"/>
-            <w:bottom w:w="0" w:type="dxa"/>
-          </w:tblCellMar>
-        </w:tblPrEx>
         <w:tc>
           <w:tcPr>
             <w:tcW w:w="2600" w:type="dxa"/>
@@ -2881,12 +2465,6 @@
         </w:tc>
       </w:tr>
       <w:tr>
-        <w:tblPrEx>
-          <w:tblCellMar>
-            <w:top w:w="0" w:type="dxa"/>
-            <w:bottom w:w="0" w:type="dxa"/>
-          </w:tblCellMar>
-        </w:tblPrEx>
         <w:tc>
           <w:tcPr>
             <w:tcW w:w="2600" w:type="dxa"/>
@@ -3054,15 +2632,7 @@
         <w:jc w:val="both"/>
       </w:pPr>
       <w:r>
-        <w:t xml:space="preserve">All chosen technologies (React, Node.js, MongoDB, </w:t>
-      </w:r>
-      <w:proofErr w:type="spellStart"/>
-      <w:r>
-        <w:t>FastAPI</w:t>
-      </w:r>
-      <w:proofErr w:type="spellEnd"/>
-      <w:r>
-        <w:t>) are open-source, well-documented, and have strong community/enterprise support, making the stack technically feasible for a small team to build and maintain.</w:t>
+        <w:t>All chosen technologies (React, Node.js, MongoDB, FastAPI) are open-source, well-documented, and have strong community/enterprise support, making the stack technically feasible for a small team to build and maintain.</w:t>
       </w:r>
     </w:p>
     <w:p>
@@ -3169,15 +2739,7 @@
         <w:spacing w:after="80" w:line="280" w:lineRule="auto"/>
       </w:pPr>
       <w:r>
-        <w:t>Third-party delivery aggregator integrations (</w:t>
-      </w:r>
-      <w:proofErr w:type="spellStart"/>
-      <w:r>
-        <w:t>UberEats</w:t>
-      </w:r>
-      <w:proofErr w:type="spellEnd"/>
-      <w:r>
-        <w:t>, DoorDash) via a unifying order API layer.</w:t>
+        <w:t>Third-party delivery aggregator integrations (UberEats, DoorDash) via a unifying order API layer.</w:t>
       </w:r>
     </w:p>
     <w:p>
@@ -3202,13 +2764,8 @@
         <w:spacing w:after="160" w:line="300" w:lineRule="auto"/>
         <w:jc w:val="both"/>
       </w:pPr>
-      <w:proofErr w:type="spellStart"/>
-      <w:r>
-        <w:t>DineSync</w:t>
-      </w:r>
-      <w:proofErr w:type="spellEnd"/>
-      <w:r>
-        <w:t xml:space="preserve"> AI addresses a clearly observable gap in the restaurant technology market: the absence of an affordable, unified, and genuinely intelligent operating system for independent and mid-sized restaurants. By combining real-time operational tooling with a purpose-built predictive AI layer inside a secure multi-tenant SaaS architecture, the project demonstrates both sound full-stack software engineering practice and practical business value.</w:t>
+      <w:r>
+        <w:t>DineSync AI addresses a clearly observable gap in the restaurant technology market: the absence of an affordable, unified, and genuinely intelligent operating system for independent and mid-sized restaurants. By combining real-time operational tooling with a purpose-built predictive AI layer inside a secure multi-tenant SaaS architecture, the project demonstrates both sound full-stack software engineering practice and practical business value.</w:t>
       </w:r>
     </w:p>
     <w:p>
@@ -3264,15 +2821,7 @@
         <w:spacing w:after="80" w:line="280" w:lineRule="auto"/>
       </w:pPr>
       <w:r>
-        <w:t xml:space="preserve">MongoDB &amp; Mongoose documentation — </w:t>
-      </w:r>
-      <w:proofErr w:type="gramStart"/>
-      <w:r>
-        <w:t>https://www.mongodb.com ,</w:t>
-      </w:r>
-      <w:proofErr w:type="gramEnd"/>
-      <w:r>
-        <w:t xml:space="preserve"> https://mongoosejs.com</w:t>
+        <w:t>MongoDB &amp; Mongoose documentation — https://www.mongodb.com , https://mongoosejs.com</w:t>
       </w:r>
     </w:p>
     <w:p>
@@ -3284,13 +2833,8 @@
         </w:numPr>
         <w:spacing w:after="80" w:line="280" w:lineRule="auto"/>
       </w:pPr>
-      <w:proofErr w:type="spellStart"/>
-      <w:r>
-        <w:t>FastAPI</w:t>
-      </w:r>
-      <w:proofErr w:type="spellEnd"/>
-      <w:r>
-        <w:t xml:space="preserve"> documentation — https://fastapi.tiangolo.com</w:t>
+      <w:r>
+        <w:t>FastAPI documentation — https://fastapi.tiangolo.com</w:t>
       </w:r>
     </w:p>
     <w:p>
@@ -3315,13 +2859,8 @@
         </w:numPr>
         <w:spacing w:after="80" w:line="280" w:lineRule="auto"/>
       </w:pPr>
-      <w:proofErr w:type="spellStart"/>
-      <w:r>
-        <w:t>DineSync</w:t>
-      </w:r>
-      <w:proofErr w:type="spellEnd"/>
-      <w:r>
-        <w:t xml:space="preserve"> AI project repository (source code and technical documentation).</w:t>
+      <w:r>
+        <w:t>DineSync AI project repository (source code and technical documentation).</w:t>
       </w:r>
     </w:p>
     <w:sectPr>
@@ -3370,61 +2909,7 @@
         <w:sz w:val="16"/>
         <w:szCs w:val="16"/>
       </w:rPr>
-      <w:t xml:space="preserve">Project </w:t>
-    </w:r>
-    <w:proofErr w:type="gramStart"/>
-    <w:r>
-      <w:rPr>
-        <w:color w:val="5A6B7A"/>
-        <w:sz w:val="16"/>
-        <w:szCs w:val="16"/>
-      </w:rPr>
-      <w:t>Synopsis  |</w:t>
-    </w:r>
-    <w:proofErr w:type="gramEnd"/>
-    <w:r>
-      <w:rPr>
-        <w:color w:val="5A6B7A"/>
-        <w:sz w:val="16"/>
-        <w:szCs w:val="16"/>
-      </w:rPr>
-      <w:t xml:space="preserve">  </w:t>
-    </w:r>
-    <w:proofErr w:type="spellStart"/>
-    <w:r>
-      <w:rPr>
-        <w:color w:val="5A6B7A"/>
-        <w:sz w:val="16"/>
-        <w:szCs w:val="16"/>
-      </w:rPr>
-      <w:t>DineSync</w:t>
-    </w:r>
-    <w:proofErr w:type="spellEnd"/>
-    <w:r>
-      <w:rPr>
-        <w:color w:val="5A6B7A"/>
-        <w:sz w:val="16"/>
-        <w:szCs w:val="16"/>
-      </w:rPr>
-      <w:t xml:space="preserve"> </w:t>
-    </w:r>
-    <w:proofErr w:type="gramStart"/>
-    <w:r>
-      <w:rPr>
-        <w:color w:val="5A6B7A"/>
-        <w:sz w:val="16"/>
-        <w:szCs w:val="16"/>
-      </w:rPr>
-      <w:t>AI  |</w:t>
-    </w:r>
-    <w:proofErr w:type="gramEnd"/>
-    <w:r>
-      <w:rPr>
-        <w:color w:val="5A6B7A"/>
-        <w:sz w:val="16"/>
-        <w:szCs w:val="16"/>
-      </w:rPr>
-      <w:t xml:space="preserve">  Page </w:t>
+      <w:t xml:space="preserve">Project Synopsis  |  DineSync AI  |  Page </w:t>
     </w:r>
     <w:r>
       <w:rPr>

</xml_diff>